<commit_message>
Added delete options for trips and expenses, and pin options for trips
</commit_message>
<xml_diff>
--- a/Idea and Design Docs/BillBlend Design Docs and Setup steps.docx
+++ b/Idea and Design Docs/BillBlend Design Docs and Setup steps.docx
@@ -619,7 +619,7 @@
         <w:ind/>
         <w:rPr>
           <w:highlight w:val="none"/>
-          <w:lang w:val="en-IN"/>
+          <w:lang w:val="en-IN" w:bidi="en-IN"/>
         </w:rPr>
       </w:pPr>
       <w:r>
@@ -627,7 +627,119 @@
           <w:highlight w:val="none"/>
           <w:lang w:val="en-IN" w:bidi="en-IN"/>
         </w:rPr>
-        <w:t xml:space="preserve">a</w:t>
+        <w:t xml:space="preserve">To push it to both main github account and sub account, commands:</w:t>
+      </w:r>
+      <w:r>
+        <w:rPr>
+          <w:highlight w:val="none"/>
+          <w:lang w:val="en-IN" w:bidi="en-IN"/>
+        </w:rPr>
+      </w:r>
+    </w:p>
+    <w:p>
+      <w:pPr>
+        <w:pBdr/>
+        <w:spacing w:after="0" w:line="276" w:lineRule="auto"/>
+        <w:ind/>
+        <w:rPr>
+          <w:highlight w:val="none"/>
+          <w:lang w:val="en-IN" w:bidi="en-IN"/>
+        </w:rPr>
+      </w:pPr>
+      <w:r>
+        <w:rPr>
+          <w:highlight w:val="none"/>
+          <w:lang w:val="en-IN" w:bidi="en-IN"/>
+        </w:rPr>
+      </w:r>
+      <w:r>
+        <w:rPr>
+          <w:highlight w:val="none"/>
+          <w:lang w:val="en-IN" w:bidi="en-IN"/>
+        </w:rPr>
+      </w:r>
+      <w:r>
+        <w:rPr>
+          <w:highlight w:val="none"/>
+          <w:lang w:val="en-IN" w:bidi="en-IN"/>
+        </w:rPr>
+      </w:r>
+    </w:p>
+    <w:p>
+      <w:pPr>
+        <w:pBdr/>
+        <w:spacing w:after="0" w:line="276" w:lineRule="auto"/>
+        <w:ind/>
+        <w:rPr>
+          <w:highlight w:val="none"/>
+          <w:lang w:val="en-IN" w:bidi="en-IN"/>
+        </w:rPr>
+      </w:pPr>
+      <w:r>
+        <w:rPr>
+          <w:highlight w:val="none"/>
+          <w:lang w:val="en-IN" w:bidi="en-IN"/>
+        </w:rPr>
+        <w:t xml:space="preserve">git push –u origin main</w:t>
+      </w:r>
+      <w:r>
+        <w:rPr>
+          <w:highlight w:val="none"/>
+          <w:lang w:val="en-IN"/>
+        </w:rPr>
+      </w:r>
+    </w:p>
+    <w:p>
+      <w:pPr>
+        <w:pBdr/>
+        <w:spacing w:after="0" w:line="276" w:lineRule="auto"/>
+        <w:ind/>
+        <w:rPr>
+          <w:highlight w:val="none"/>
+          <w:lang w:val="en-IN"/>
+        </w:rPr>
+      </w:pPr>
+      <w:r>
+        <w:rPr>
+          <w:highlight w:val="none"/>
+          <w:lang w:val="en-IN"/>
+        </w:rPr>
+      </w:r>
+      <w:r>
+        <w:rPr>
+          <w:highlight w:val="none"/>
+          <w:lang w:val="en-IN"/>
+        </w:rPr>
+      </w:r>
+      <w:r>
+        <w:rPr>
+          <w:highlight w:val="none"/>
+          <w:lang w:val="en-IN"/>
+        </w:rPr>
+      </w:r>
+    </w:p>
+    <w:p>
+      <w:pPr>
+        <w:pBdr/>
+        <w:spacing w:after="0" w:line="276" w:lineRule="auto"/>
+        <w:ind/>
+        <w:rPr>
+          <w:highlight w:val="none"/>
+          <w:lang w:val="en-IN" w:bidi="en-IN"/>
+        </w:rPr>
+      </w:pPr>
+      <w:r>
+        <w:rPr>
+          <w:highlight w:val="none"/>
+          <w:lang w:val="en-IN" w:bidi="en-IN"/>
+        </w:rPr>
+      </w:r>
+      <w:r>
+        <w:rPr>
+          <w:highlight w:val="none"/>
+          <w:lang w:val="en-IN" w:bidi="en-IN"/>
+        </w:rPr>
+        <w:t xml:space="preserve">git subtree push --prefix="billblend_webapp/billblend" deploy-origin main</w:t>
       </w:r>
       <w:r>
         <w:rPr>
@@ -639,6 +751,180 @@
         <w:rPr>
           <w:highlight w:val="none"/>
           <w:lang w:val="en-IN"/>
+        </w:rPr>
+      </w:r>
+    </w:p>
+    <w:p>
+      <w:pPr>
+        <w:pBdr/>
+        <w:spacing w:after="0" w:line="276" w:lineRule="auto"/>
+        <w:ind/>
+        <w:rPr>
+          <w:highlight w:val="none"/>
+          <w:lang w:val="en-IN"/>
+        </w:rPr>
+      </w:pPr>
+      <w:r>
+        <w:rPr>
+          <w:highlight w:val="none"/>
+          <w:lang w:val="en-IN"/>
+        </w:rPr>
+      </w:r>
+      <w:r>
+        <w:rPr>
+          <w:highlight w:val="none"/>
+          <w:lang w:val="en-IN"/>
+        </w:rPr>
+      </w:r>
+      <w:r>
+        <w:rPr>
+          <w:highlight w:val="none"/>
+          <w:lang w:val="en-IN"/>
+        </w:rPr>
+      </w:r>
+    </w:p>
+    <w:p>
+      <w:pPr>
+        <w:pBdr/>
+        <w:spacing w:after="0" w:line="276" w:lineRule="auto"/>
+        <w:ind/>
+        <w:rPr>
+          <w:b/>
+          <w:bCs/>
+          <w:sz w:val="32"/>
+          <w:szCs w:val="32"/>
+          <w:highlight w:val="none"/>
+          <w:u w:val="single"/>
+        </w:rPr>
+      </w:pPr>
+      <w:r>
+        <w:rPr>
+          <w:b/>
+          <w:bCs/>
+          <w:sz w:val="32"/>
+          <w:szCs w:val="32"/>
+          <w:highlight w:val="none"/>
+          <w:u w:val="single"/>
+          <w:lang w:val="en-IN"/>
+        </w:rPr>
+      </w:r>
+      <w:r>
+        <w:rPr>
+          <w:b/>
+          <w:bCs/>
+          <w:sz w:val="32"/>
+          <w:szCs w:val="32"/>
+          <w:highlight w:val="none"/>
+          <w:u w:val="single"/>
+          <w:lang w:val="en-IN"/>
+        </w:rPr>
+      </w:r>
+      <w:r>
+        <w:rPr>
+          <w:b/>
+          <w:bCs/>
+          <w:sz w:val="32"/>
+          <w:szCs w:val="32"/>
+          <w:highlight w:val="none"/>
+          <w:u w:val="single"/>
+          <w:lang w:val="en-IN"/>
+        </w:rPr>
+      </w:r>
+    </w:p>
+    <w:p>
+      <w:pPr>
+        <w:pBdr/>
+        <w:spacing w:after="0" w:line="276" w:lineRule="auto"/>
+        <w:ind/>
+        <w:rPr>
+          <w:b/>
+          <w:bCs/>
+          <w:sz w:val="32"/>
+          <w:szCs w:val="32"/>
+          <w:highlight w:val="none"/>
+          <w:u w:val="single"/>
+        </w:rPr>
+      </w:pPr>
+      <w:r>
+        <w:rPr>
+          <w:b/>
+          <w:bCs/>
+          <w:sz w:val="32"/>
+          <w:szCs w:val="32"/>
+          <w:highlight w:val="none"/>
+          <w:u w:val="single"/>
+          <w:lang w:val="en-IN" w:bidi="en-IN"/>
+        </w:rPr>
+        <w:t xml:space="preserve">Dev Launch on local machine or testing:</w:t>
+      </w:r>
+      <w:r>
+        <w:rPr>
+          <w:b/>
+          <w:bCs/>
+          <w:sz w:val="32"/>
+          <w:szCs w:val="32"/>
+          <w:highlight w:val="none"/>
+          <w:u w:val="single"/>
+          <w:lang w:val="en-IN"/>
+        </w:rPr>
+      </w:r>
+    </w:p>
+    <w:p>
+      <w:pPr>
+        <w:pBdr/>
+        <w:spacing w:after="0" w:line="276" w:lineRule="auto"/>
+        <w:ind/>
+        <w:rPr>
+          <w:highlight w:val="none"/>
+          <w:lang w:val="en-IN"/>
+        </w:rPr>
+      </w:pPr>
+      <w:r>
+        <w:rPr>
+          <w:highlight w:val="none"/>
+          <w:lang w:val="en-IN"/>
+        </w:rPr>
+      </w:r>
+      <w:r>
+        <w:rPr>
+          <w:highlight w:val="none"/>
+          <w:lang w:val="en-IN"/>
+        </w:rPr>
+      </w:r>
+      <w:r>
+        <w:rPr>
+          <w:highlight w:val="none"/>
+          <w:lang w:val="en-IN"/>
+        </w:rPr>
+      </w:r>
+    </w:p>
+    <w:p>
+      <w:pPr>
+        <w:pBdr/>
+        <w:spacing w:after="0" w:line="276" w:lineRule="auto"/>
+        <w:ind/>
+        <w:rPr>
+          <w:highlight w:val="none"/>
+          <w:lang w:val="en-IN"/>
+        </w:rPr>
+      </w:pPr>
+      <w:r>
+        <w:rPr>
+          <w:highlight w:val="none"/>
+          <w:lang w:val="en-IN" w:bidi="en-IN"/>
+        </w:rPr>
+        <w:t xml:space="preserve">npm run dev</w:t>
+      </w:r>
+      <w:r>
+        <w:rPr>
+          <w:highlight w:val="none"/>
+          <w:lang w:val="en-IN" w:bidi="en-IN"/>
+        </w:rPr>
+      </w:r>
+      <w:r>
+        <w:rPr>
+          <w:highlight w:val="none"/>
+          <w:lang w:val="en-IN" w:bidi="en-IN"/>
         </w:rPr>
       </w:r>
     </w:p>

</xml_diff>

<commit_message>
Added features: Import group memberss from other group, export expense to csv, app tutorial and guide, and light and dark mode toggle
</commit_message>
<xml_diff>
--- a/Idea and Design Docs/BillBlend Design Docs and Setup steps.docx
+++ b/Idea and Design Docs/BillBlend Design Docs and Setup steps.docx
@@ -582,6 +582,16 @@
           <w:lang w:val="en-IN"/>
         </w:rPr>
       </w:r>
+      <w:r>
+        <w:rPr>
+          <w:b/>
+          <w:bCs/>
+          <w:sz w:val="48"/>
+          <w:szCs w:val="48"/>
+          <w:highlight w:val="none"/>
+          <w:u w:val="single"/>
+        </w:rPr>
+      </w:r>
     </w:p>
     <w:p>
       <w:pPr>
@@ -593,12 +603,6 @@
           <w:lang w:val="en-IN"/>
         </w:rPr>
       </w:pPr>
-      <w:r>
-        <w:rPr>
-          <w:highlight w:val="none"/>
-          <w:lang w:val="en-IN" w:bidi="en-IN"/>
-        </w:rPr>
-      </w:r>
       <w:r>
         <w:rPr>
           <w:highlight w:val="none"/>
@@ -611,6 +615,12 @@
           <w:lang w:val="en-IN"/>
         </w:rPr>
       </w:r>
+      <w:r>
+        <w:rPr>
+          <w:highlight w:val="none"/>
+          <w:lang w:val="en-IN"/>
+        </w:rPr>
+      </w:r>
     </w:p>
     <w:p>
       <w:pPr>
@@ -628,6 +638,12 @@
           <w:lang w:val="en-IN" w:bidi="en-IN"/>
         </w:rPr>
         <w:t xml:space="preserve">To push it to both main github account and sub account, commands:</w:t>
+      </w:r>
+      <w:r>
+        <w:rPr>
+          <w:highlight w:val="none"/>
+          <w:lang w:val="en-IN" w:bidi="en-IN"/>
+        </w:rPr>
       </w:r>
       <w:r>
         <w:rPr>
@@ -688,6 +704,12 @@
           <w:lang w:val="en-IN"/>
         </w:rPr>
       </w:r>
+      <w:r>
+        <w:rPr>
+          <w:highlight w:val="none"/>
+          <w:lang w:val="en-IN" w:bidi="en-IN"/>
+        </w:rPr>
+      </w:r>
     </w:p>
     <w:p>
       <w:pPr>
@@ -744,13 +766,13 @@
       <w:r>
         <w:rPr>
           <w:highlight w:val="none"/>
-          <w:lang w:val="en-IN" w:bidi="en-IN"/>
+          <w:lang w:val="en-IN"/>
         </w:rPr>
       </w:r>
       <w:r>
         <w:rPr>
           <w:highlight w:val="none"/>
-          <w:lang w:val="en-IN"/>
+          <w:lang w:val="en-IN" w:bidi="en-IN"/>
         </w:rPr>
       </w:r>
     </w:p>
@@ -827,7 +849,6 @@
           <w:szCs w:val="32"/>
           <w:highlight w:val="none"/>
           <w:u w:val="single"/>
-          <w:lang w:val="en-IN"/>
         </w:rPr>
       </w:r>
     </w:p>
@@ -868,6 +889,16 @@
           <w:lang w:val="en-IN"/>
         </w:rPr>
       </w:r>
+      <w:r>
+        <w:rPr>
+          <w:b/>
+          <w:bCs/>
+          <w:sz w:val="32"/>
+          <w:szCs w:val="32"/>
+          <w:highlight w:val="none"/>
+          <w:u w:val="single"/>
+        </w:rPr>
+      </w:r>
     </w:p>
     <w:p>
       <w:pPr>
@@ -905,7 +936,7 @@
         <w:ind/>
         <w:rPr>
           <w:highlight w:val="none"/>
-          <w:lang w:val="en-IN"/>
+          <w:lang w:val="en-IN" w:bidi="en-IN"/>
         </w:rPr>
       </w:pPr>
       <w:r>
@@ -914,6 +945,93 @@
           <w:lang w:val="en-IN" w:bidi="en-IN"/>
         </w:rPr>
         <w:t xml:space="preserve">npm run dev</w:t>
+      </w:r>
+      <w:r>
+        <w:rPr>
+          <w:highlight w:val="none"/>
+          <w:lang w:val="en-IN" w:bidi="en-IN"/>
+        </w:rPr>
+      </w:r>
+      <w:r>
+        <w:rPr>
+          <w:highlight w:val="none"/>
+          <w:lang w:val="en-IN"/>
+        </w:rPr>
+      </w:r>
+    </w:p>
+    <w:p>
+      <w:pPr>
+        <w:pBdr/>
+        <w:spacing w:after="0" w:line="276" w:lineRule="auto"/>
+        <w:ind/>
+        <w:rPr>
+          <w:highlight w:val="none"/>
+          <w:lang w:val="en-IN"/>
+        </w:rPr>
+      </w:pPr>
+      <w:r>
+        <w:rPr>
+          <w:highlight w:val="none"/>
+          <w:lang w:val="en-IN"/>
+        </w:rPr>
+      </w:r>
+      <w:r>
+        <w:rPr>
+          <w:highlight w:val="none"/>
+          <w:lang w:val="en-IN"/>
+        </w:rPr>
+      </w:r>
+      <w:r>
+        <w:rPr>
+          <w:highlight w:val="none"/>
+          <w:lang w:val="en-IN"/>
+        </w:rPr>
+      </w:r>
+    </w:p>
+    <w:p>
+      <w:pPr>
+        <w:pBdr/>
+        <w:spacing w:after="0" w:line="276" w:lineRule="auto"/>
+        <w:ind/>
+        <w:rPr>
+          <w:highlight w:val="none"/>
+          <w:lang w:val="en-IN"/>
+        </w:rPr>
+      </w:pPr>
+      <w:r>
+        <w:rPr>
+          <w:highlight w:val="none"/>
+          <w:lang w:val="en-IN"/>
+        </w:rPr>
+      </w:r>
+      <w:r>
+        <w:rPr>
+          <w:highlight w:val="none"/>
+          <w:lang w:val="en-IN"/>
+        </w:rPr>
+      </w:r>
+      <w:r>
+        <w:rPr>
+          <w:highlight w:val="none"/>
+          <w:lang w:val="en-IN"/>
+        </w:rPr>
+      </w:r>
+    </w:p>
+    <w:p>
+      <w:pPr>
+        <w:pBdr/>
+        <w:spacing w:after="0" w:line="276" w:lineRule="auto"/>
+        <w:ind/>
+        <w:rPr>
+          <w:highlight w:val="none"/>
+          <w:lang w:val="en-IN"/>
+        </w:rPr>
+      </w:pPr>
+      <w:r>
+        <w:rPr>
+          <w:highlight w:val="none"/>
+          <w:lang w:val="en-IN" w:bidi="en-IN"/>
+        </w:rPr>
       </w:r>
       <w:r>
         <w:rPr>

</xml_diff>